<commit_message>
Relative holidays computed for last year + support save without computations
</commit_message>
<xml_diff>
--- a/Docs/Workers Rights Upgrade - 2025 a - New way to compute holidays by part of year.docx
+++ b/Docs/Workers Rights Upgrade - 2025 a - New way to compute holidays by part of year.docx
@@ -18,6 +18,230 @@
     </w:p>
     <w:p>
       <w:pPr>
+        <w:rPr>
+          <w:lang w:val="en-US"/>
+        </w:rPr>
+      </w:pPr>
+    </w:p>
+    <w:p>
+      <w:pPr>
+        <w:pStyle w:val="Heading2"/>
+        <w:rPr>
+          <w:lang w:val="en-US"/>
+        </w:rPr>
+      </w:pPr>
+      <w:r>
+        <w:rPr>
+          <w:lang w:val="en-US"/>
+        </w:rPr>
+        <w:t>Compute pay per each holiday day – 11/1/25</w:t>
+      </w:r>
+    </w:p>
+    <w:p>
+      <w:pPr>
+        <w:rPr>
+          <w:lang w:val="en-US"/>
+        </w:rPr>
+      </w:pPr>
+      <w:r>
+        <w:rPr>
+          <w:lang w:val="en-US"/>
+        </w:rPr>
+        <w:t xml:space="preserve">It used to be according to specific days – with selection of best rate </w:t>
+      </w:r>
+      <w:r>
+        <w:rPr>
+          <mc:AlternateContent>
+            <mc:Choice Requires="w16se"/>
+            <mc:Fallback>
+              <w:rFonts w:ascii="Segoe UI Emoji" w:eastAsia="Segoe UI Emoji" w:hAnsi="Segoe UI Emoji" w:cs="Segoe UI Emoji"/>
+            </mc:Fallback>
+          </mc:AlternateContent>
+          <w:lang w:val="en-US"/>
+        </w:rPr>
+        <mc:AlternateContent>
+          <mc:Choice Requires="w16se">
+            <w16se:symEx w16se:font="Segoe UI Emoji" w16se:char="1F60A"/>
+          </mc:Choice>
+          <mc:Fallback>
+            <w:t>😊</w:t>
+          </mc:Fallback>
+        </mc:AlternateContent>
+      </w:r>
+    </w:p>
+    <w:p>
+      <w:pPr>
+        <w:rPr>
+          <w:lang w:val="en-US"/>
+        </w:rPr>
+      </w:pPr>
+      <w:r>
+        <w:rPr>
+          <w:lang w:val="en-US"/>
+        </w:rPr>
+        <w:t>Now, according to Iris, if computed by Relative, use wage rate at time of payment (latest)</w:t>
+      </w:r>
+    </w:p>
+    <w:p>
+      <w:pPr>
+        <w:rPr>
+          <w:lang w:val="en-US"/>
+        </w:rPr>
+      </w:pPr>
+    </w:p>
+    <w:p>
+      <w:pPr>
+        <w:pStyle w:val="Heading2"/>
+        <w:rPr>
+          <w:lang w:val="en-US"/>
+        </w:rPr>
+      </w:pPr>
+      <w:r>
+        <w:rPr>
+          <w:lang w:val="en-US"/>
+        </w:rPr>
+        <w:t>Computing possible holidays in last year in relative mode – 10-11/1/25</w:t>
+      </w:r>
+    </w:p>
+    <w:p>
+      <w:pPr>
+        <w:rPr>
+          <w:lang w:val="en-US"/>
+        </w:rPr>
+      </w:pPr>
+      <w:r>
+        <w:rPr>
+          <w:lang w:val="en-US"/>
+        </w:rPr>
+        <w:t>Take whole year – and divide by 9.</w:t>
+      </w:r>
+    </w:p>
+    <w:p>
+      <w:pPr>
+        <w:rPr>
+          <w:lang w:val="en-US"/>
+        </w:rPr>
+      </w:pPr>
+      <w:r>
+        <w:rPr>
+          <w:lang w:val="en-US"/>
+        </w:rPr>
+        <w:t>Even one day creates possible 1 holiday!</w:t>
+      </w:r>
+    </w:p>
+    <w:p>
+      <w:pPr>
+        <w:rPr>
+          <w:lang w:val="en-US"/>
+        </w:rPr>
+      </w:pPr>
+      <w:r>
+        <w:rPr>
+          <w:lang w:val="en-US"/>
+        </w:rPr>
+        <w:t>Where is there already computation of last year partiality? It should be in Vacation &amp; Recuperation.</w:t>
+      </w:r>
+    </w:p>
+    <w:p>
+      <w:pPr>
+        <w:rPr>
+          <w:lang w:val="en-US"/>
+        </w:rPr>
+      </w:pPr>
+    </w:p>
+    <w:p>
+      <w:pPr>
+        <w:pStyle w:val="Heading2"/>
+        <w:rPr>
+          <w:lang w:val="en-US"/>
+        </w:rPr>
+      </w:pPr>
+      <w:r>
+        <w:rPr>
+          <w:lang w:val="en-US"/>
+        </w:rPr>
+        <w:t>Working on relative vs real days modes – 9</w:t>
+      </w:r>
+      <w:r>
+        <w:rPr>
+          <w:lang w:val="en-US"/>
+        </w:rPr>
+        <w:t>-10</w:t>
+      </w:r>
+      <w:r>
+        <w:rPr>
+          <w:lang w:val="en-US"/>
+        </w:rPr>
+        <w:t>/1/25</w:t>
+      </w:r>
+    </w:p>
+    <w:p>
+      <w:pPr>
+        <w:rPr>
+          <w:lang w:val="en-US"/>
+        </w:rPr>
+      </w:pPr>
+      <w:r>
+        <w:rPr>
+          <w:lang w:val="en-US"/>
+        </w:rPr>
+        <w:t>Mode 3 radio buttons should be saves and restored as part of main GUI.</w:t>
+      </w:r>
+    </w:p>
+    <w:p>
+      <w:pPr>
+        <w:rPr>
+          <w:lang w:val="en-US"/>
+        </w:rPr>
+      </w:pPr>
+      <w:r>
+        <w:rPr>
+          <w:lang w:val="en-US"/>
+        </w:rPr>
+        <w:t xml:space="preserve">While loading old save - </w:t>
+      </w:r>
+    </w:p>
+    <w:p>
+      <w:pPr>
+        <w:ind w:firstLine="720"/>
+        <w:rPr>
+          <w:lang w:val="en-US"/>
+        </w:rPr>
+      </w:pPr>
+      <w:r>
+        <w:rPr>
+          <w:lang w:val="en-US"/>
+        </w:rPr>
+        <w:t xml:space="preserve">If no relevant button was saved and holidays were selected – set it to “real </w:t>
+      </w:r>
+      <w:r>
+        <w:rPr>
+          <w:lang w:val="en-US"/>
+        </w:rPr>
+        <w:t>holi</w:t>
+      </w:r>
+      <w:r>
+        <w:rPr>
+          <w:lang w:val="en-US"/>
+        </w:rPr>
+        <w:t>days</w:t>
+      </w:r>
+      <w:r>
+        <w:rPr>
+          <w:lang w:val="en-US"/>
+        </w:rPr>
+        <w:t>.</w:t>
+      </w:r>
+      <w:r>
+        <w:rPr>
+          <w:lang w:val="en-US"/>
+        </w:rPr>
+        <w:t>”</w:t>
+      </w:r>
+    </w:p>
+    <w:p>
+      <w:pPr>
+        <w:ind w:firstLine="720"/>
         <w:rPr>
           <w:lang w:val="en-US"/>
         </w:rPr>

</xml_diff>

<commit_message>
V1.4.0 Beta 0.5 ready for tests - Holiday relative to days worked on This Year(last) year seems to be working
</commit_message>
<xml_diff>
--- a/Docs/Workers Rights Upgrade - 2025 a - New way to compute holidays by part of year.docx
+++ b/Docs/Workers Rights Upgrade - 2025 a - New way to compute holidays by part of year.docx
@@ -22,6 +22,425 @@
           <w:lang w:val="en-US"/>
         </w:rPr>
       </w:pPr>
+    </w:p>
+    <w:p>
+      <w:pPr>
+        <w:pStyle w:val="Heading2"/>
+        <w:rPr>
+          <w:lang w:val="en-US"/>
+        </w:rPr>
+      </w:pPr>
+      <w:r>
+        <w:rPr>
+          <w:lang w:val="en-US"/>
+        </w:rPr>
+        <w:t>Check work with old cases – should be backward compatible! 11-12/1/25</w:t>
+      </w:r>
+    </w:p>
+    <w:p>
+      <w:pPr>
+        <w:rPr>
+          <w:lang w:val="en-US"/>
+        </w:rPr>
+      </w:pPr>
+      <w:r>
+        <w:rPr>
+          <w:lang w:val="en-US"/>
+        </w:rPr>
+        <w:t>Allow moving from old case “by days” to “relative” and back…</w:t>
+      </w:r>
+    </w:p>
+    <w:p>
+      <w:pPr>
+        <w:rPr>
+          <w:lang w:val="en-US"/>
+        </w:rPr>
+      </w:pPr>
+      <w:r>
+        <w:rPr>
+          <w:lang w:val="en-US"/>
+        </w:rPr>
+        <w:t>Check “real days” dialog</w:t>
+      </w:r>
+    </w:p>
+    <w:p>
+      <w:pPr>
+        <w:rPr>
+          <w:lang w:val="en-US"/>
+        </w:rPr>
+      </w:pPr>
+      <w:r>
+        <w:rPr>
+          <w:lang w:val="en-US"/>
+        </w:rPr>
+        <w:t>Batch-check of old cases…</w:t>
+      </w:r>
+    </w:p>
+    <w:p>
+      <w:pPr>
+        <w:rPr>
+          <w:lang w:val="en-US"/>
+        </w:rPr>
+      </w:pPr>
+    </w:p>
+    <w:p>
+      <w:pPr>
+        <w:pStyle w:val="Heading2"/>
+        <w:rPr>
+          <w:lang w:val="en-US"/>
+        </w:rPr>
+      </w:pPr>
+      <w:r>
+        <w:rPr>
+          <w:lang w:val="en-US"/>
+        </w:rPr>
+        <w:t>Iris is checking v1.4.0 beta 0.5 – 11/1/25</w:t>
+      </w:r>
+    </w:p>
+    <w:p>
+      <w:pPr>
+        <w:rPr>
+          <w:lang w:val="en-US"/>
+        </w:rPr>
+      </w:pPr>
+      <w:r>
+        <w:rPr>
+          <w:lang w:val="en-US"/>
+        </w:rPr>
+        <w:t>It seems to be working</w:t>
+      </w:r>
+    </w:p>
+    <w:p>
+      <w:pPr>
+        <w:rPr>
+          <w:lang w:val="en-US"/>
+        </w:rPr>
+      </w:pPr>
+      <w:r>
+        <w:rPr>
+          <w:lang w:val="en-US"/>
+        </w:rPr>
+        <w:t xml:space="preserve">After solving issue with the definition of the working days – </w:t>
+      </w:r>
+    </w:p>
+    <w:p>
+      <w:pPr>
+        <w:rPr>
+          <w:lang w:val="en-US"/>
+        </w:rPr>
+      </w:pPr>
+      <w:r>
+        <w:rPr>
+          <w:lang w:val="en-US"/>
+        </w:rPr>
+        <w:t>And adding radio button for 5 or 6 work days (defaults is 6).</w:t>
+      </w:r>
+    </w:p>
+    <w:p>
+      <w:pPr>
+        <w:rPr>
+          <w:lang w:val="en-US"/>
+        </w:rPr>
+      </w:pPr>
+    </w:p>
+    <w:p>
+      <w:pPr>
+        <w:pStyle w:val="Heading2"/>
+        <w:rPr>
+          <w:lang w:val="en-US"/>
+        </w:rPr>
+      </w:pPr>
+      <w:r>
+        <w:rPr>
+          <w:lang w:val="en-US"/>
+        </w:rPr>
+        <w:t xml:space="preserve">Check computation of last year + GUI interactivity + </w:t>
+      </w:r>
+      <w:r>
+        <w:rPr>
+          <w:lang w:val="en-US"/>
+        </w:rPr>
+        <w:t xml:space="preserve">Letters + Saves + </w:t>
+      </w:r>
+      <w:r>
+        <w:rPr>
+          <w:lang w:val="en-US"/>
+        </w:rPr>
+        <w:t>Logs – 11/1/24</w:t>
+      </w:r>
+    </w:p>
+    <w:p>
+      <w:pPr>
+        <w:rPr>
+          <w:lang w:val="en-US"/>
+        </w:rPr>
+      </w:pPr>
+      <w:r>
+        <w:rPr>
+          <w:lang w:val="en-US"/>
+        </w:rPr>
+        <w:t>Why “Due” field is not updated?</w:t>
+      </w:r>
+    </w:p>
+    <w:p>
+      <w:pPr>
+        <w:pStyle w:val="Heading4"/>
+        <w:rPr>
+          <w:lang w:val="en-US"/>
+        </w:rPr>
+      </w:pPr>
+      <w:r>
+        <w:rPr>
+          <w:lang w:val="en-US"/>
+        </w:rPr>
+        <w:t>Look at previous version</w:t>
+      </w:r>
+    </w:p>
+    <w:p>
+      <w:pPr>
+        <w:rPr>
+          <w:lang w:val="en-IL"/>
+        </w:rPr>
+      </w:pPr>
+      <w:r>
+        <w:rPr>
+          <w:lang w:val="en-IL"/>
+        </w:rPr>
+        <w:t xml:space="preserve">void </w:t>
+      </w:r>
+      <w:proofErr w:type="spellStart"/>
+      <w:r>
+        <w:rPr>
+          <w:lang w:val="en-IL"/>
+        </w:rPr>
+        <w:t>CHolidaysDuePerYear</w:t>
+      </w:r>
+      <w:proofErr w:type="spellEnd"/>
+      <w:r>
+        <w:rPr>
+          <w:lang w:val="en-IL"/>
+        </w:rPr>
+        <w:t>::</w:t>
+      </w:r>
+      <w:proofErr w:type="spellStart"/>
+      <w:r>
+        <w:rPr>
+          <w:lang w:val="en-IL"/>
+        </w:rPr>
+        <w:t>OnGuiChange</w:t>
+      </w:r>
+      <w:proofErr w:type="spellEnd"/>
+      <w:r>
+        <w:rPr>
+          <w:lang w:val="en-IL"/>
+        </w:rPr>
+        <w:t>(</w:t>
+      </w:r>
+      <w:proofErr w:type="spellStart"/>
+      <w:r>
+        <w:rPr>
+          <w:lang w:val="en-IL"/>
+        </w:rPr>
+        <w:t>CMyDialogEx</w:t>
+      </w:r>
+      <w:proofErr w:type="spellEnd"/>
+      <w:r>
+        <w:rPr>
+          <w:lang w:val="en-IL"/>
+        </w:rPr>
+        <w:t xml:space="preserve">* </w:t>
+      </w:r>
+      <w:proofErr w:type="spellStart"/>
+      <w:r>
+        <w:rPr>
+          <w:lang w:val="en-IL"/>
+        </w:rPr>
+        <w:t>pDlg</w:t>
+      </w:r>
+      <w:proofErr w:type="spellEnd"/>
+      <w:r>
+        <w:rPr>
+          <w:lang w:val="en-IL"/>
+        </w:rPr>
+        <w:t>)</w:t>
+      </w:r>
+    </w:p>
+    <w:p>
+      <w:pPr>
+        <w:rPr>
+          <w:lang w:val="en-IL"/>
+        </w:rPr>
+      </w:pPr>
+      <w:r>
+        <w:rPr>
+          <w:lang w:val="en-IL"/>
+        </w:rPr>
+        <w:t xml:space="preserve">Called by: </w:t>
+      </w:r>
+      <w:r>
+        <w:rPr>
+          <w:lang w:val="en-IL"/>
+        </w:rPr>
+        <w:t xml:space="preserve">void </w:t>
+      </w:r>
+      <w:proofErr w:type="spellStart"/>
+      <w:r>
+        <w:rPr>
+          <w:lang w:val="en-IL"/>
+        </w:rPr>
+        <w:t>CHolidaysDue</w:t>
+      </w:r>
+      <w:proofErr w:type="spellEnd"/>
+      <w:r>
+        <w:rPr>
+          <w:lang w:val="en-IL"/>
+        </w:rPr>
+        <w:t>::</w:t>
+      </w:r>
+      <w:proofErr w:type="spellStart"/>
+      <w:r>
+        <w:rPr>
+          <w:lang w:val="en-IL"/>
+        </w:rPr>
+        <w:t>OnMainDialogChange</w:t>
+      </w:r>
+      <w:proofErr w:type="spellEnd"/>
+      <w:r>
+        <w:rPr>
+          <w:lang w:val="en-IL"/>
+        </w:rPr>
+        <w:t>(</w:t>
+      </w:r>
+      <w:proofErr w:type="spellStart"/>
+      <w:r>
+        <w:rPr>
+          <w:lang w:val="en-IL"/>
+        </w:rPr>
+        <w:t>CMyDialogEx</w:t>
+      </w:r>
+      <w:proofErr w:type="spellEnd"/>
+      <w:r>
+        <w:rPr>
+          <w:lang w:val="en-IL"/>
+        </w:rPr>
+        <w:t xml:space="preserve">* </w:t>
+      </w:r>
+      <w:proofErr w:type="spellStart"/>
+      <w:r>
+        <w:rPr>
+          <w:lang w:val="en-IL"/>
+        </w:rPr>
+        <w:t>pMainDlg</w:t>
+      </w:r>
+      <w:proofErr w:type="spellEnd"/>
+      <w:r>
+        <w:rPr>
+          <w:lang w:val="en-IL"/>
+        </w:rPr>
+        <w:t>)</w:t>
+      </w:r>
+    </w:p>
+    <w:p>
+      <w:pPr>
+        <w:rPr>
+          <w:lang w:val="en-IL"/>
+        </w:rPr>
+      </w:pPr>
+      <w:r>
+        <w:rPr>
+          <w:lang w:val="en-IL"/>
+        </w:rPr>
+        <w:t xml:space="preserve">Called by: </w:t>
+      </w:r>
+      <w:r>
+        <w:rPr>
+          <w:lang w:val="en-IL"/>
+        </w:rPr>
+        <w:t xml:space="preserve">void </w:t>
+      </w:r>
+      <w:proofErr w:type="spellStart"/>
+      <w:r>
+        <w:rPr>
+          <w:lang w:val="en-IL"/>
+        </w:rPr>
+        <w:t>CWorkersRightsComputerDlg</w:t>
+      </w:r>
+      <w:proofErr w:type="spellEnd"/>
+      <w:r>
+        <w:rPr>
+          <w:lang w:val="en-IL"/>
+        </w:rPr>
+        <w:t>::</w:t>
+      </w:r>
+      <w:proofErr w:type="spellStart"/>
+      <w:r>
+        <w:rPr>
+          <w:lang w:val="en-IL"/>
+        </w:rPr>
+        <w:t>OnInputChange</w:t>
+      </w:r>
+      <w:proofErr w:type="spellEnd"/>
+      <w:r>
+        <w:rPr>
+          <w:lang w:val="en-IL"/>
+        </w:rPr>
+        <w:t xml:space="preserve">(bool </w:t>
+      </w:r>
+      <w:proofErr w:type="spellStart"/>
+      <w:r>
+        <w:rPr>
+          <w:lang w:val="en-IL"/>
+        </w:rPr>
+        <w:t>bJustLoaded</w:t>
+      </w:r>
+      <w:proofErr w:type="spellEnd"/>
+      <w:r>
+        <w:rPr>
+          <w:lang w:val="en-IL"/>
+        </w:rPr>
+        <w:t>)</w:t>
+      </w:r>
+    </w:p>
+    <w:p>
+      <w:pPr>
+        <w:pStyle w:val="Heading4"/>
+        <w:rPr>
+          <w:lang w:val="en-US"/>
+        </w:rPr>
+      </w:pPr>
+      <w:r>
+        <w:rPr>
+          <w:lang w:val="en-US"/>
+        </w:rPr>
+        <w:t>Where are the holidays mode flags?</w:t>
+      </w:r>
+    </w:p>
+    <w:p>
+      <w:pPr>
+        <w:rPr>
+          <w:lang w:val="en-US"/>
+        </w:rPr>
+      </w:pPr>
+      <w:r>
+        <w:rPr>
+          <w:lang w:val="en-US"/>
+        </w:rPr>
+        <w:t xml:space="preserve">In </w:t>
+      </w:r>
+      <w:proofErr w:type="spellStart"/>
+      <w:r>
+        <w:rPr>
+          <w:lang w:val="en-US"/>
+        </w:rPr>
+        <w:t>gHolidaysDue</w:t>
+      </w:r>
+      <w:proofErr w:type="spellEnd"/>
+      <w:r>
+        <w:rPr>
+          <w:lang w:val="en-US"/>
+        </w:rPr>
+        <w:t xml:space="preserve"> </w:t>
+      </w:r>
     </w:p>
     <w:p>
       <w:pPr>
@@ -84,6 +503,73 @@
     </w:p>
     <w:p>
       <w:pPr>
+        <w:pStyle w:val="Heading4"/>
+        <w:rPr>
+          <w:lang w:val="en-US"/>
+        </w:rPr>
+      </w:pPr>
+      <w:r>
+        <w:rPr>
+          <w:lang w:val="en-US"/>
+        </w:rPr>
+        <w:t>Function “</w:t>
+      </w:r>
+      <w:r>
+        <w:rPr>
+          <w:lang w:val="en-IL"/>
+        </w:rPr>
+        <w:t xml:space="preserve">void </w:t>
+      </w:r>
+      <w:proofErr w:type="spellStart"/>
+      <w:r>
+        <w:rPr>
+          <w:lang w:val="en-IL"/>
+        </w:rPr>
+        <w:t>CHolidays</w:t>
+      </w:r>
+      <w:proofErr w:type="spellEnd"/>
+      <w:r>
+        <w:rPr>
+          <w:lang w:val="en-IL"/>
+        </w:rPr>
+        <w:t>::</w:t>
+      </w:r>
+      <w:proofErr w:type="spellStart"/>
+      <w:r>
+        <w:rPr>
+          <w:lang w:val="en-IL"/>
+        </w:rPr>
+        <w:t>ComputePayLastYear</w:t>
+      </w:r>
+      <w:proofErr w:type="spellEnd"/>
+      <w:r>
+        <w:rPr>
+          <w:lang w:val="en-IL"/>
+        </w:rPr>
+        <w:t>(void)</w:t>
+      </w:r>
+      <w:r>
+        <w:rPr>
+          <w:lang w:val="en-US"/>
+        </w:rPr>
+        <w:t>”</w:t>
+      </w:r>
+    </w:p>
+    <w:p>
+      <w:pPr>
+        <w:rPr>
+          <w:lang w:val="en-US"/>
+        </w:rPr>
+      </w:pPr>
+      <w:r>
+        <w:rPr>
+          <w:lang w:val="en-US"/>
+        </w:rPr>
+        <w:t xml:space="preserve">Input: </w:t>
+      </w:r>
+    </w:p>
+    <w:p>
+      <w:pPr>
         <w:rPr>
           <w:lang w:val="en-US"/>
         </w:rPr>
@@ -348,6 +834,7 @@
         <w:rPr>
           <w:lang w:val="en-US"/>
         </w:rPr>
+        <w:lastRenderedPageBreak/>
         <w:t>Request</w:t>
       </w:r>
     </w:p>
@@ -862,10 +1349,53 @@
       <w:szCs w:val="26"/>
     </w:rPr>
   </w:style>
+  <w:style w:type="paragraph" w:styleId="Heading3">
+    <w:name w:val="heading 3"/>
+    <w:basedOn w:val="Normal"/>
+    <w:next w:val="Normal"/>
+    <w:link w:val="Heading3Char"/>
+    <w:uiPriority w:val="9"/>
+    <w:unhideWhenUsed/>
+    <w:qFormat/>
+    <w:rsid w:val="006F00C3"/>
+    <w:pPr>
+      <w:keepNext/>
+      <w:keepLines/>
+      <w:spacing w:before="40" w:after="0"/>
+      <w:outlineLvl w:val="2"/>
+    </w:pPr>
+    <w:rPr>
+      <w:rFonts w:asciiTheme="majorHAnsi" w:eastAsiaTheme="majorEastAsia" w:hAnsiTheme="majorHAnsi" w:cstheme="majorBidi"/>
+      <w:color w:val="1F3763" w:themeColor="accent1" w:themeShade="7F"/>
+      <w:sz w:val="24"/>
+      <w:szCs w:val="24"/>
+    </w:rPr>
+  </w:style>
+  <w:style w:type="paragraph" w:styleId="Heading4">
+    <w:name w:val="heading 4"/>
+    <w:basedOn w:val="Normal"/>
+    <w:next w:val="Normal"/>
+    <w:link w:val="Heading4Char"/>
+    <w:uiPriority w:val="9"/>
+    <w:unhideWhenUsed/>
+    <w:qFormat/>
+    <w:rsid w:val="006F00C3"/>
+    <w:pPr>
+      <w:keepNext/>
+      <w:keepLines/>
+      <w:spacing w:before="40" w:after="0"/>
+      <w:outlineLvl w:val="3"/>
+    </w:pPr>
+    <w:rPr>
+      <w:rFonts w:asciiTheme="majorHAnsi" w:eastAsiaTheme="majorEastAsia" w:hAnsiTheme="majorHAnsi" w:cstheme="majorBidi"/>
+      <w:i/>
+      <w:iCs/>
+      <w:color w:val="2F5496" w:themeColor="accent1" w:themeShade="BF"/>
+    </w:rPr>
+  </w:style>
   <w:style w:type="character" w:default="1" w:styleId="DefaultParagraphFont">
     <w:name w:val="Default Paragraph Font"/>
     <w:uiPriority w:val="1"/>
-    <w:semiHidden/>
     <w:unhideWhenUsed/>
   </w:style>
   <w:style w:type="table" w:default="1" w:styleId="TableNormal">
@@ -913,6 +1443,32 @@
       <w:color w:val="2F5496" w:themeColor="accent1" w:themeShade="BF"/>
       <w:sz w:val="26"/>
       <w:szCs w:val="26"/>
+    </w:rPr>
+  </w:style>
+  <w:style w:type="character" w:customStyle="1" w:styleId="Heading3Char">
+    <w:name w:val="Heading 3 Char"/>
+    <w:basedOn w:val="DefaultParagraphFont"/>
+    <w:link w:val="Heading3"/>
+    <w:uiPriority w:val="9"/>
+    <w:rsid w:val="006F00C3"/>
+    <w:rPr>
+      <w:rFonts w:asciiTheme="majorHAnsi" w:eastAsiaTheme="majorEastAsia" w:hAnsiTheme="majorHAnsi" w:cstheme="majorBidi"/>
+      <w:color w:val="1F3763" w:themeColor="accent1" w:themeShade="7F"/>
+      <w:sz w:val="24"/>
+      <w:szCs w:val="24"/>
+    </w:rPr>
+  </w:style>
+  <w:style w:type="character" w:customStyle="1" w:styleId="Heading4Char">
+    <w:name w:val="Heading 4 Char"/>
+    <w:basedOn w:val="DefaultParagraphFont"/>
+    <w:link w:val="Heading4"/>
+    <w:uiPriority w:val="9"/>
+    <w:rsid w:val="006F00C3"/>
+    <w:rPr>
+      <w:rFonts w:asciiTheme="majorHAnsi" w:eastAsiaTheme="majorEastAsia" w:hAnsiTheme="majorHAnsi" w:cstheme="majorBidi"/>
+      <w:i/>
+      <w:iCs/>
+      <w:color w:val="2F5496" w:themeColor="accent1" w:themeShade="BF"/>
     </w:rPr>
   </w:style>
 </w:styles>

</xml_diff>

<commit_message>
v1.4.0 beta 1 - Holidays computations and GUI work in relative or old "By Day" modes
</commit_message>
<xml_diff>
--- a/Docs/Workers Rights Upgrade - 2025 a - New way to compute holidays by part of year.docx
+++ b/Docs/Workers Rights Upgrade - 2025 a - New way to compute holidays by part of year.docx
@@ -14,6 +14,53 @@
           <w:lang w:val="en-US"/>
         </w:rPr>
         <w:t>Enable computing holidays by part of relevant year</w:t>
+      </w:r>
+    </w:p>
+    <w:p>
+      <w:pPr>
+        <w:rPr>
+          <w:lang w:val="en-US"/>
+        </w:rPr>
+      </w:pPr>
+    </w:p>
+    <w:p>
+      <w:pPr>
+        <w:pStyle w:val="Heading2"/>
+        <w:rPr>
+          <w:lang w:val="en-US"/>
+        </w:rPr>
+      </w:pPr>
+      <w:r>
+        <w:rPr>
+          <w:lang w:val="en-US"/>
+        </w:rPr>
+        <w:t>Check saving of “by Day” holidays mode – 12/1/25</w:t>
+      </w:r>
+    </w:p>
+    <w:p>
+      <w:pPr>
+        <w:rPr>
+          <w:lang w:val="en-US"/>
+        </w:rPr>
+      </w:pPr>
+      <w:r>
+        <w:rPr>
+          <w:lang w:val="en-US"/>
+        </w:rPr>
+        <w:t>Holidays selection is saved and restored.</w:t>
+      </w:r>
+    </w:p>
+    <w:p>
+      <w:pPr>
+        <w:rPr>
+          <w:lang w:val="en-US"/>
+        </w:rPr>
+      </w:pPr>
+      <w:r>
+        <w:rPr>
+          <w:lang w:val="en-US"/>
+        </w:rPr>
+        <w:t>Special days selection is lost…</w:t>
       </w:r>
     </w:p>
     <w:p>
@@ -782,6 +829,7 @@
         <w:rPr>
           <w:lang w:val="en-US"/>
         </w:rPr>
+        <w:lastRenderedPageBreak/>
         <w:t>As I start working Config is “</w:t>
       </w:r>
       <w:r>
@@ -834,7 +882,6 @@
         <w:rPr>
           <w:lang w:val="en-US"/>
         </w:rPr>
-        <w:lastRenderedPageBreak/>
         <w:t>Request</w:t>
       </w:r>
     </w:p>

</xml_diff>

<commit_message>
Bug in v1.4.0.beta1 was corrected - create beta2. Holidays rate was missing in letters. Documents Updated.
</commit_message>
<xml_diff>
--- a/Docs/Workers Rights Upgrade - 2025 a - New way to compute holidays by part of year.docx
+++ b/Docs/Workers Rights Upgrade - 2025 a - New way to compute holidays by part of year.docx
@@ -27,6 +27,324 @@
       <w:pPr>
         <w:pStyle w:val="Heading2"/>
         <w:rPr>
+          <w:lang w:val="en-US" w:bidi="ar-JO"/>
+        </w:rPr>
+      </w:pPr>
+      <w:r>
+        <w:rPr>
+          <w:lang w:val="en-US" w:bidi="ar-JO"/>
+        </w:rPr>
+        <w:t xml:space="preserve">Bug corrected – create </w:t>
+      </w:r>
+      <w:r>
+        <w:rPr>
+          <w:lang w:val="en-US" w:bidi="ar-JO"/>
+        </w:rPr>
+        <w:t>v1.4.0.beta</w:t>
+      </w:r>
+      <w:r>
+        <w:rPr>
+          <w:lang w:val="en-US" w:bidi="ar-JO"/>
+        </w:rPr>
+        <w:t>2</w:t>
+      </w:r>
+      <w:r>
+        <w:rPr>
+          <w:lang w:val="en-US" w:bidi="ar-JO"/>
+        </w:rPr>
+        <w:t xml:space="preserve"> – 13/1/25</w:t>
+      </w:r>
+    </w:p>
+    <w:p>
+      <w:pPr>
+        <w:rPr>
+          <w:lang w:val="en-US" w:bidi="ar-JO"/>
+        </w:rPr>
+      </w:pPr>
+      <w:r>
+        <w:rPr>
+          <w:lang w:val="en-US" w:bidi="ar-JO"/>
+        </w:rPr>
+        <w:t>Pay rate for holidays (for last year) was missing in letters.</w:t>
+      </w:r>
+    </w:p>
+    <w:p>
+      <w:pPr>
+        <w:rPr>
+          <w:lang w:val="en-US" w:bidi="ar-JO"/>
+        </w:rPr>
+      </w:pPr>
+      <w:r>
+        <w:rPr>
+          <w:lang w:val="en-US" w:bidi="ar-JO"/>
+        </w:rPr>
+        <w:t>Now it is saved…</w:t>
+      </w:r>
+    </w:p>
+    <w:p>
+      <w:pPr>
+        <w:rPr>
+          <w:lang w:val="en-US" w:bidi="ar-JO"/>
+        </w:rPr>
+      </w:pPr>
+      <w:r>
+        <w:rPr>
+          <w:lang w:val="en-US" w:bidi="ar-JO"/>
+        </w:rPr>
+        <w:t>BUT – what if there is no pay for last year – but there is for previous years?</w:t>
+      </w:r>
+    </w:p>
+    <w:p>
+      <w:pPr>
+        <w:rPr>
+          <w:lang w:val="en-US" w:bidi="ar-JO"/>
+        </w:rPr>
+      </w:pPr>
+    </w:p>
+    <w:p>
+      <w:pPr>
+        <w:pStyle w:val="Heading2"/>
+        <w:rPr>
+          <w:lang w:val="en-US" w:bidi="ar-JO"/>
+        </w:rPr>
+      </w:pPr>
+      <w:r>
+        <w:rPr>
+          <w:lang w:val="en-US" w:bidi="ar-JO"/>
+        </w:rPr>
+        <w:t>Testing v1.4.0.beta1 – 13/1/25</w:t>
+      </w:r>
+    </w:p>
+    <w:p>
+      <w:pPr>
+        <w:rPr>
+          <w:lang w:val="en-US" w:bidi="ar-JO"/>
+        </w:rPr>
+      </w:pPr>
+      <w:r>
+        <w:rPr>
+          <w:lang w:val="en-US" w:bidi="ar-JO"/>
+        </w:rPr>
+        <w:t>Cases for testing are in:</w:t>
+      </w:r>
+    </w:p>
+    <w:p>
+      <w:pPr>
+        <w:rPr>
+          <w:lang w:val="en-US" w:bidi="ar-JO"/>
+        </w:rPr>
+      </w:pPr>
+      <w:r>
+        <w:rPr>
+          <w:lang w:val="en-US" w:bidi="ar-JO"/>
+        </w:rPr>
+        <w:t>D:\WRC\testing\Test_50_cases</w:t>
+      </w:r>
+      <w:r>
+        <w:rPr>
+          <w:lang w:val="en-US" w:bidi="ar-JO"/>
+        </w:rPr>
+        <w:t xml:space="preserve"> (Actually 44 directories with saved cases…)</w:t>
+      </w:r>
+    </w:p>
+    <w:p>
+      <w:pPr>
+        <w:rPr>
+          <w:lang w:val="en-US" w:bidi="ar-JO"/>
+        </w:rPr>
+      </w:pPr>
+      <w:r>
+        <w:rPr>
+          <w:lang w:val="en-US" w:bidi="ar-JO"/>
+        </w:rPr>
+        <w:t>Run test batch with latest used version: “</w:t>
+      </w:r>
+      <w:r>
+        <w:rPr>
+          <w:lang w:val="en-US" w:bidi="ar-JO"/>
+        </w:rPr>
+        <w:t>D:\WRC\Install\WorkersRights_v1.3.6_beta1\Release</w:t>
+      </w:r>
+      <w:r>
+        <w:rPr>
+          <w:lang w:val="en-US" w:bidi="ar-JO"/>
+        </w:rPr>
+        <w:t>”</w:t>
+      </w:r>
+    </w:p>
+    <w:p>
+      <w:pPr>
+        <w:rPr>
+          <w:lang w:val="en-US" w:bidi="ar-JO"/>
+        </w:rPr>
+      </w:pPr>
+      <w:r>
+        <w:rPr>
+          <w:lang w:val="en-US" w:bidi="ar-JO"/>
+        </w:rPr>
+        <w:t>Run same test batch with new version “</w:t>
+      </w:r>
+      <w:r>
+        <w:rPr>
+          <w:lang w:val="en-US" w:bidi="ar-JO"/>
+        </w:rPr>
+        <w:t>D:\WRC\Install\WorkersRights_v1.4.0_beta1\Release</w:t>
+      </w:r>
+      <w:r>
+        <w:rPr>
+          <w:lang w:val="en-US" w:bidi="ar-JO"/>
+        </w:rPr>
+        <w:t>”</w:t>
+      </w:r>
+    </w:p>
+    <w:p>
+      <w:pPr>
+        <w:rPr>
+          <w:lang w:val="en-US" w:bidi="ar-JO"/>
+        </w:rPr>
+      </w:pPr>
+      <w:r>
+        <w:rPr>
+          <w:lang w:val="en-US" w:bidi="ar-JO"/>
+        </w:rPr>
+        <w:t>Now there are 4 result files in “</w:t>
+      </w:r>
+      <w:r>
+        <w:rPr>
+          <w:lang w:val="en-US" w:bidi="ar-JO"/>
+        </w:rPr>
+        <w:t>D:\WRC\testing\Test_50_cases</w:t>
+      </w:r>
+      <w:r>
+        <w:rPr>
+          <w:lang w:val="en-US" w:bidi="ar-JO"/>
+        </w:rPr>
+        <w:t>.”</w:t>
+      </w:r>
+    </w:p>
+    <w:p>
+      <w:pPr>
+        <w:rPr>
+          <w:lang w:val="en-US" w:bidi="ar-JO"/>
+        </w:rPr>
+      </w:pPr>
+      <w:r>
+        <w:rPr>
+          <w:lang w:val="en-US" w:bidi="ar-JO"/>
+        </w:rPr>
+        <w:t>Use “diff” to compare:</w:t>
+      </w:r>
+    </w:p>
+    <w:p>
+      <w:pPr>
+        <w:rPr>
+          <w:lang w:val="en-US" w:bidi="ar-JO"/>
+        </w:rPr>
+      </w:pPr>
+      <w:r>
+        <w:rPr>
+          <w:lang w:val="en-US" w:bidi="ar-JO"/>
+        </w:rPr>
+        <w:t>“</w:t>
+      </w:r>
+      <w:r>
+        <w:rPr>
+          <w:lang w:val="en-US" w:bidi="ar-JO"/>
+        </w:rPr>
+        <w:t>VerifyBatch_v1.3.6.beta1.log</w:t>
+      </w:r>
+      <w:r>
+        <w:rPr>
+          <w:lang w:val="en-US" w:bidi="ar-JO"/>
+        </w:rPr>
+        <w:t>”</w:t>
+      </w:r>
+      <w:r>
+        <w:rPr>
+          <w:lang w:val="en-US" w:bidi="ar-JO"/>
+        </w:rPr>
+        <w:t xml:space="preserve"> </w:t>
+      </w:r>
+      <w:r>
+        <w:rPr>
+          <w:lang w:val="en-US" w:bidi="ar-JO"/>
+        </w:rPr>
+        <w:t>w</w:t>
+      </w:r>
+      <w:r>
+        <w:rPr>
+          <w:lang w:val="en-US" w:bidi="ar-JO"/>
+        </w:rPr>
+        <w:t>ith</w:t>
+      </w:r>
+    </w:p>
+    <w:p>
+      <w:pPr>
+        <w:rPr>
+          <w:lang w:val="en-US" w:bidi="ar-JO"/>
+        </w:rPr>
+      </w:pPr>
+      <w:r>
+        <w:rPr>
+          <w:lang w:val="en-US" w:bidi="ar-JO"/>
+        </w:rPr>
+        <w:t xml:space="preserve"> “</w:t>
+      </w:r>
+      <w:r>
+        <w:rPr>
+          <w:lang w:val="en-US" w:bidi="ar-JO"/>
+        </w:rPr>
+        <w:t>VerifyBatch_v1.4.0.beta0.7.log</w:t>
+      </w:r>
+      <w:r>
+        <w:rPr>
+          <w:lang w:val="en-US" w:bidi="ar-JO"/>
+        </w:rPr>
+        <w:t>”</w:t>
+      </w:r>
+    </w:p>
+    <w:p>
+      <w:pPr>
+        <w:rPr>
+          <w:lang w:val="en-US" w:bidi="ar-JO"/>
+        </w:rPr>
+      </w:pPr>
+      <w:r>
+        <w:rPr>
+          <w:lang w:val="en-US" w:bidi="ar-JO"/>
+        </w:rPr>
+        <w:t>Only one case differ: “</w:t>
+      </w:r>
+      <w:r>
+        <w:rPr>
+          <w:lang w:val="en-US" w:bidi="ar-JO"/>
+        </w:rPr>
+        <w:t xml:space="preserve">D:\WRC\testing\Test_50_cases\try_try_0\try_try_0_save.xml - </w:t>
+      </w:r>
+      <w:r>
+        <w:rPr>
+          <w:highlight w:val="yellow"/>
+          <w:lang w:val="en-US" w:bidi="ar-JO"/>
+        </w:rPr>
+        <w:t>1</w:t>
+      </w:r>
+      <w:r>
+        <w:rPr>
+          <w:lang w:val="en-US" w:bidi="ar-JO"/>
+        </w:rPr>
+        <w:t xml:space="preserve"> / 8 differ</w:t>
+      </w:r>
+      <w:r>
+        <w:rPr>
+          <w:lang w:val="en-US" w:bidi="ar-JO"/>
+        </w:rPr>
+        <w:t>”</w:t>
+      </w:r>
+    </w:p>
+    <w:p>
+      <w:pPr>
+        <w:pStyle w:val="Heading2"/>
+        <w:rPr>
           <w:lang w:val="en-US"/>
         </w:rPr>
       </w:pPr>
@@ -66,6 +384,8 @@
     <w:p>
       <w:pPr>
         <w:rPr>
+          <w:rFonts w:hint="cs"/>
+          <w:rtl/>
           <w:lang w:val="en-US"/>
         </w:rPr>
       </w:pPr>
@@ -559,6 +879,7 @@
         <w:rPr>
           <w:lang w:val="en-US"/>
         </w:rPr>
+        <w:lastRenderedPageBreak/>
         <w:t>Function “</w:t>
       </w:r>
       <w:r>
@@ -829,7 +1150,6 @@
         <w:rPr>
           <w:lang w:val="en-US"/>
         </w:rPr>
-        <w:lastRenderedPageBreak/>
         <w:t>As I start working Config is “</w:t>
       </w:r>
       <w:r>

</xml_diff>